<commit_message>
Rename SiSePuede to CDPM in the docs: first mention 'CDPM (formerly SiSePuede)' plus a name note; Word files rebuilt; file, repo and code names unchanged
Co-Authored-By: Claude Opus 5.5 <noreply@anthropic.com>
Claude-Session: https://claude.ai/code/session_01ShqHsb9J8KnPwk6Cjy8jGC
</commit_message>
<xml_diff>
--- a/InvestmentNeeds/Mitigation_Investment_Needs_Methodology.docx
+++ b/InvestmentNeeds/Mitigation_Investment_Needs_Methodology.docx
@@ -9,6 +9,24 @@
       </w:pPr>
       <w:r>
         <w:t xml:space="preserve">Mitigation Investment Needs Model: Methodology</w:t>
+      </w:r>
+    </w:p>
+    <w:p>
+      <w:pPr>
+        <w:pStyle w:val="BlockText"/>
+      </w:pPr>
+      <w:r>
+        <w:rPr>
+          <w:bCs/>
+          <w:b/>
+        </w:rPr>
+        <w:t xml:space="preserve">Name.</w:t>
+      </w:r>
+      <w:r>
+        <w:t xml:space="preserve"> </w:t>
+      </w:r>
+      <w:r>
+        <w:t xml:space="preserve">CDPM was formerly called SiSePuede (and CPM). Studies published before the change use the old name; file, repository and code names keep it too.</w:t>
       </w:r>
     </w:p>
     <w:p>
@@ -758,7 +776,7 @@
               <w:jc w:val="left"/>
             </w:pPr>
             <w:r>
-              <w:t xml:space="preserve">I less the investment a current-policies baseline would make in the same sectors. Comparable with the CCDRs and SISEPUEDE.</w:t>
+              <w:t xml:space="preserve">I less the investment a current-policies baseline would make in the same sectors. Comparable with the CCDRs and CDPM (formerly SiSePuede).</w:t>
             </w:r>
           </w:p>
         </w:tc>
@@ -1116,7 +1134,7 @@
         <w:pStyle w:val="FirstParagraph"/>
       </w:pPr>
       <w:r>
-        <w:t xml:space="preserve">The model is the Tier 3 version of the SISEPUEDE-based method: published group totals are shared out to countries by physical drivers, then each country’s incremental capital is costed at three rates against country-specific savings and co-benefits. Equation numbers follow the method note.</w:t>
+        <w:t xml:space="preserve">The model is the Tier 3 version of the CDPM-based method: published group totals are shared out to countries by physical drivers, then each country’s incremental capital is costed at three rates against country-specific savings and co-benefits. Equation numbers follow the method note.</w:t>
       </w:r>
     </w:p>
     <w:p>
@@ -1879,7 +1897,7 @@
         <w:pStyle w:val="FirstParagraph"/>
       </w:pPr>
       <w:r>
-        <w:t xml:space="preserve">Version 1.1 replaces the single savings ratio for half the investment with physics: power and transport now derive b, c and a from each country’s fuel mix, prices and pollution costs, and grids, fuels and AFOLU no longer get savings they do not produce. This was the weakest part of v1.0, where one ratio (b = 0.133, calibrated on SISEPUEDE’s Latin American results) set the sign of every result.</w:t>
+        <w:t xml:space="preserve">Version 1.1 replaces the single savings ratio for half the investment with physics: power and transport now derive b, c and a from each country’s fuel mix, prices and pollution costs, and grids, fuels and AFOLU no longer get savings they do not produce. This was the weakest part of v1.0, where one ratio (b = 0.133, calibrated on CDPM’s Latin American results) set the sign of every result.</w:t>
       </w:r>
     </w:p>
     <w:p>
@@ -3946,7 +3964,7 @@
         <w:t xml:space="preserve"> </w:t>
       </w:r>
       <w:r>
-        <w:t xml:space="preserve">the premium (an assumption; SISEPUEDE used USD 13,000 for 2019, IEA reports near parity in China); transit and rail are costed as if they were EVs; no congestion or crash benefits are counted.</w:t>
+        <w:t xml:space="preserve">the premium (an assumption; CDPM used USD 13,000 for 2019, IEA reports near parity in China); transit and rail are costed as if they were EVs; no congestion or crash benefits are counted.</w:t>
       </w:r>
     </w:p>
     <w:bookmarkEnd w:id="27"/>
@@ -4022,7 +4040,7 @@
         <w:t xml:space="preserve"> </w:t>
       </w:r>
       <w:r>
-        <w:t xml:space="preserve">still calibrated: b = 0.133 and c = 0.129 (SISEPUEDE LAC), moved by the country fuel-cost and air-pollution indices; a = 0.35.</w:t>
+        <w:t xml:space="preserve">still calibrated: b = 0.133 and c = 0.129 (CDPM LAC), moved by the country fuel-cost and air-pollution indices; a = 0.35.</w:t>
       </w:r>
     </w:p>
     <w:p>
@@ -9712,7 +9730,7 @@
               <w:jc w:val="left"/>
             </w:pPr>
             <w:r>
-              <w:t xml:space="preserve">SISEPUEDE LAC (Kalra et al. 2023)</w:t>
+              <w:t xml:space="preserve">CDPM LAC (Kalra et al. 2023)</w:t>
             </w:r>
           </w:p>
         </w:tc>
@@ -9762,7 +9780,7 @@
               <w:jc w:val="left"/>
             </w:pPr>
             <w:r>
-              <w:t xml:space="preserve">SISEPUEDE LAC</w:t>
+              <w:t xml:space="preserve">CDPM LAC</w:t>
             </w:r>
           </w:p>
         </w:tc>
@@ -9812,7 +9830,7 @@
               <w:jc w:val="left"/>
             </w:pPr>
             <w:r>
-              <w:t xml:space="preserve">SISEPUEDE LAC</w:t>
+              <w:t xml:space="preserve">CDPM LAC</w:t>
             </w:r>
           </w:p>
         </w:tc>
@@ -9873,7 +9891,7 @@
         <w:pStyle w:val="BodyText"/>
       </w:pPr>
       <w:r>
-        <w:t xml:space="preserve">The model is low against SISEPUEDE for Brazil and the Dominican Republic. SISEPUEDE covers non-capital technical costs and all of AFOLU, which this model counts only as a share of a regional pool.</w:t>
+        <w:t xml:space="preserve">The model is low against CDPM for Brazil and the Dominican Republic. CDPM covers non-capital technical costs and all of AFOLU, which this model counts only as a share of a regional pool.</w:t>
       </w:r>
     </w:p>
     <w:p>
@@ -9917,7 +9935,7 @@
         <w:pStyle w:val="FirstParagraph"/>
       </w:pPr>
       <w:r>
-        <w:t xml:space="preserve">A national model for every country is feasible, and the current workbook is its skeleton: what is missing is a physical pathway per country (module 2), which today is borrowed from group totals. Replacing the allocation with country stock-turnover modelling turns a Tier 3 estimate into a Tier 2 one for all ~190 countries, with Tier 1 (SISEPUEDE or CCDR runs) wherever those exist.</w:t>
+        <w:t xml:space="preserve">A national model for every country is feasible, and the current workbook is its skeleton: what is missing is a physical pathway per country (module 2), which today is borrowed from group totals. Replacing the allocation with country stock-turnover modelling turns a Tier 3 estimate into a Tier 2 one for all ~190 countries, with Tier 1 (CDPM or CCDR runs) wherever those exist.</w:t>
       </w:r>
     </w:p>
     <w:p>
@@ -10103,7 +10121,7 @@
               <w:jc w:val="left"/>
             </w:pPr>
             <w:r>
-              <w:t xml:space="preserve">SISEPUEDE (18 LAC; Uganda, Morocco, Libya in progress), CCDR models</w:t>
+              <w:t xml:space="preserve">CDPM (18 LAC; Uganda, Morocco, Libya in progress), CCDR models</w:t>
             </w:r>
           </w:p>
         </w:tc>
@@ -10465,7 +10483,7 @@
               <w:jc w:val="left"/>
             </w:pPr>
             <w:r>
-              <w:t xml:space="preserve">Annual 2025-2050 results, three lenses, Monte Carlo, Tier 1 overrides from SISEPUEDE and CCDRs</w:t>
+              <w:t xml:space="preserve">Annual 2025-2050 results, three lenses, Monte Carlo, Tier 1 overrides from CDPM and CCDRs</w:t>
             </w:r>
           </w:p>
         </w:tc>
@@ -12085,7 +12103,7 @@
           <w:iCs/>
           <w:i/>
         </w:rPr>
-        <w:t xml:space="preserve">Global Investment Needs for Climate Action: A Method Based on SISEPUEDE</w:t>
+        <w:t xml:space="preserve">Global Investment Needs for Climate Action: A Method Based on CDPM</w:t>
       </w:r>
       <w:r>
         <w:t xml:space="preserve"> </w:t>
@@ -13071,7 +13089,7 @@
       <w:color w:themeColor="accent1" w:themeShade="BF" w:val="365F91"/>
     </w:rPr>
   </w:style>
-  <w:style w:type="paragraph" w:customStyle="1" w:styleId="SourceCode">
+  <w:style w:customStyle="1" w:styleId="SourceCode" w:type="paragraph">
     <w:name w:val="Source Code"/>
     <w:basedOn w:val="Normal"/>
     <w:link w:val="VerbatimChar"/>
@@ -13079,7 +13097,7 @@
       <w:wordWrap w:val="off"/>
     </w:pPr>
   </w:style>
-  <w:style w:type="character" w:customStyle="1" w:styleId="KeywordTok">
+  <w:style w:customStyle="1" w:styleId="KeywordTok" w:type="character">
     <w:name w:val="KeywordTok"/>
     <w:basedOn w:val="VerbatimChar"/>
     <w:rPr>
@@ -13087,77 +13105,77 @@
       <w:b/>
     </w:rPr>
   </w:style>
-  <w:style w:type="character" w:customStyle="1" w:styleId="DataTypeTok">
+  <w:style w:customStyle="1" w:styleId="DataTypeTok" w:type="character">
     <w:name w:val="DataTypeTok"/>
     <w:basedOn w:val="VerbatimChar"/>
     <w:rPr>
       <w:color w:val="902000"/>
     </w:rPr>
   </w:style>
-  <w:style w:type="character" w:customStyle="1" w:styleId="DecValTok">
+  <w:style w:customStyle="1" w:styleId="DecValTok" w:type="character">
     <w:name w:val="DecValTok"/>
     <w:basedOn w:val="VerbatimChar"/>
     <w:rPr>
       <w:color w:val="40a070"/>
     </w:rPr>
   </w:style>
-  <w:style w:type="character" w:customStyle="1" w:styleId="BaseNTok">
+  <w:style w:customStyle="1" w:styleId="BaseNTok" w:type="character">
     <w:name w:val="BaseNTok"/>
     <w:basedOn w:val="VerbatimChar"/>
     <w:rPr>
       <w:color w:val="40a070"/>
     </w:rPr>
   </w:style>
-  <w:style w:type="character" w:customStyle="1" w:styleId="FloatTok">
+  <w:style w:customStyle="1" w:styleId="FloatTok" w:type="character">
     <w:name w:val="FloatTok"/>
     <w:basedOn w:val="VerbatimChar"/>
     <w:rPr>
       <w:color w:val="40a070"/>
     </w:rPr>
   </w:style>
-  <w:style w:type="character" w:customStyle="1" w:styleId="ConstantTok">
+  <w:style w:customStyle="1" w:styleId="ConstantTok" w:type="character">
     <w:name w:val="ConstantTok"/>
     <w:basedOn w:val="VerbatimChar"/>
     <w:rPr>
       <w:color w:val="880000"/>
     </w:rPr>
   </w:style>
-  <w:style w:type="character" w:customStyle="1" w:styleId="CharTok">
+  <w:style w:customStyle="1" w:styleId="CharTok" w:type="character">
     <w:name w:val="CharTok"/>
     <w:basedOn w:val="VerbatimChar"/>
     <w:rPr>
       <w:color w:val="4070a0"/>
     </w:rPr>
   </w:style>
-  <w:style w:type="character" w:customStyle="1" w:styleId="SpecialCharTok">
+  <w:style w:customStyle="1" w:styleId="SpecialCharTok" w:type="character">
     <w:name w:val="SpecialCharTok"/>
     <w:basedOn w:val="VerbatimChar"/>
     <w:rPr>
       <w:color w:val="4070a0"/>
     </w:rPr>
   </w:style>
-  <w:style w:type="character" w:customStyle="1" w:styleId="StringTok">
+  <w:style w:customStyle="1" w:styleId="StringTok" w:type="character">
     <w:name w:val="StringTok"/>
     <w:basedOn w:val="VerbatimChar"/>
     <w:rPr>
       <w:color w:val="4070a0"/>
     </w:rPr>
   </w:style>
-  <w:style w:type="character" w:customStyle="1" w:styleId="VerbatimStringTok">
+  <w:style w:customStyle="1" w:styleId="VerbatimStringTok" w:type="character">
     <w:name w:val="VerbatimStringTok"/>
     <w:basedOn w:val="VerbatimChar"/>
     <w:rPr>
       <w:color w:val="4070a0"/>
     </w:rPr>
   </w:style>
-  <w:style w:type="character" w:customStyle="1" w:styleId="SpecialStringTok">
+  <w:style w:customStyle="1" w:styleId="SpecialStringTok" w:type="character">
     <w:name w:val="SpecialStringTok"/>
     <w:basedOn w:val="VerbatimChar"/>
     <w:rPr>
       <w:color w:val="bb6688"/>
     </w:rPr>
   </w:style>
-  <w:style w:type="character" w:customStyle="1" w:styleId="ImportTok">
+  <w:style w:customStyle="1" w:styleId="ImportTok" w:type="character">
     <w:name w:val="ImportTok"/>
     <w:basedOn w:val="VerbatimChar"/>
     <w:rPr>
@@ -13165,7 +13183,7 @@
       <w:b/>
     </w:rPr>
   </w:style>
-  <w:style w:type="character" w:customStyle="1" w:styleId="CommentTok">
+  <w:style w:customStyle="1" w:styleId="CommentTok" w:type="character">
     <w:name w:val="CommentTok"/>
     <w:basedOn w:val="VerbatimChar"/>
     <w:rPr>
@@ -13173,7 +13191,7 @@
       <w:i/>
     </w:rPr>
   </w:style>
-  <w:style w:type="character" w:customStyle="1" w:styleId="DocumentationTok">
+  <w:style w:customStyle="1" w:styleId="DocumentationTok" w:type="character">
     <w:name w:val="DocumentationTok"/>
     <w:basedOn w:val="VerbatimChar"/>
     <w:rPr>
@@ -13181,7 +13199,7 @@
       <w:i/>
     </w:rPr>
   </w:style>
-  <w:style w:type="character" w:customStyle="1" w:styleId="AnnotationTok">
+  <w:style w:customStyle="1" w:styleId="AnnotationTok" w:type="character">
     <w:name w:val="AnnotationTok"/>
     <w:basedOn w:val="VerbatimChar"/>
     <w:rPr>
@@ -13190,7 +13208,7 @@
       <w:i/>
     </w:rPr>
   </w:style>
-  <w:style w:type="character" w:customStyle="1" w:styleId="CommentVarTok">
+  <w:style w:customStyle="1" w:styleId="CommentVarTok" w:type="character">
     <w:name w:val="CommentVarTok"/>
     <w:basedOn w:val="VerbatimChar"/>
     <w:rPr>
@@ -13199,28 +13217,28 @@
       <w:i/>
     </w:rPr>
   </w:style>
-  <w:style w:type="character" w:customStyle="1" w:styleId="OtherTok">
+  <w:style w:customStyle="1" w:styleId="OtherTok" w:type="character">
     <w:name w:val="OtherTok"/>
     <w:basedOn w:val="VerbatimChar"/>
     <w:rPr>
       <w:color w:val="007020"/>
     </w:rPr>
   </w:style>
-  <w:style w:type="character" w:customStyle="1" w:styleId="FunctionTok">
+  <w:style w:customStyle="1" w:styleId="FunctionTok" w:type="character">
     <w:name w:val="FunctionTok"/>
     <w:basedOn w:val="VerbatimChar"/>
     <w:rPr>
       <w:color w:val="06287e"/>
     </w:rPr>
   </w:style>
-  <w:style w:type="character" w:customStyle="1" w:styleId="VariableTok">
+  <w:style w:customStyle="1" w:styleId="VariableTok" w:type="character">
     <w:name w:val="VariableTok"/>
     <w:basedOn w:val="VerbatimChar"/>
     <w:rPr>
       <w:color w:val="19177c"/>
     </w:rPr>
   </w:style>
-  <w:style w:type="character" w:customStyle="1" w:styleId="ControlFlowTok">
+  <w:style w:customStyle="1" w:styleId="ControlFlowTok" w:type="character">
     <w:name w:val="ControlFlowTok"/>
     <w:basedOn w:val="VerbatimChar"/>
     <w:rPr>
@@ -13228,45 +13246,45 @@
       <w:b/>
     </w:rPr>
   </w:style>
-  <w:style w:type="character" w:customStyle="1" w:styleId="OperatorTok">
+  <w:style w:customStyle="1" w:styleId="OperatorTok" w:type="character">
     <w:name w:val="OperatorTok"/>
     <w:basedOn w:val="VerbatimChar"/>
     <w:rPr>
       <w:color w:val="666666"/>
     </w:rPr>
   </w:style>
-  <w:style w:type="character" w:customStyle="1" w:styleId="BuiltInTok">
+  <w:style w:customStyle="1" w:styleId="BuiltInTok" w:type="character">
     <w:name w:val="BuiltInTok"/>
     <w:basedOn w:val="VerbatimChar"/>
     <w:rPr>
       <w:color w:val="008000"/>
     </w:rPr>
   </w:style>
-  <w:style w:type="character" w:customStyle="1" w:styleId="ExtensionTok">
+  <w:style w:customStyle="1" w:styleId="ExtensionTok" w:type="character">
     <w:name w:val="ExtensionTok"/>
     <w:basedOn w:val="VerbatimChar"/>
     <w:rPr/>
   </w:style>
-  <w:style w:type="character" w:customStyle="1" w:styleId="PreprocessorTok">
+  <w:style w:customStyle="1" w:styleId="PreprocessorTok" w:type="character">
     <w:name w:val="PreprocessorTok"/>
     <w:basedOn w:val="VerbatimChar"/>
     <w:rPr>
       <w:color w:val="bc7a00"/>
     </w:rPr>
   </w:style>
-  <w:style w:type="character" w:customStyle="1" w:styleId="AttributeTok">
+  <w:style w:customStyle="1" w:styleId="AttributeTok" w:type="character">
     <w:name w:val="AttributeTok"/>
     <w:basedOn w:val="VerbatimChar"/>
     <w:rPr>
       <w:color w:val="7d9029"/>
     </w:rPr>
   </w:style>
-  <w:style w:type="character" w:customStyle="1" w:styleId="RegionMarkerTok">
+  <w:style w:customStyle="1" w:styleId="RegionMarkerTok" w:type="character">
     <w:name w:val="RegionMarkerTok"/>
     <w:basedOn w:val="VerbatimChar"/>
     <w:rPr/>
   </w:style>
-  <w:style w:type="character" w:customStyle="1" w:styleId="InformationTok">
+  <w:style w:customStyle="1" w:styleId="InformationTok" w:type="character">
     <w:name w:val="InformationTok"/>
     <w:basedOn w:val="VerbatimChar"/>
     <w:rPr>
@@ -13275,7 +13293,7 @@
       <w:i/>
     </w:rPr>
   </w:style>
-  <w:style w:type="character" w:customStyle="1" w:styleId="WarningTok">
+  <w:style w:customStyle="1" w:styleId="WarningTok" w:type="character">
     <w:name w:val="WarningTok"/>
     <w:basedOn w:val="VerbatimChar"/>
     <w:rPr>
@@ -13284,7 +13302,7 @@
       <w:i/>
     </w:rPr>
   </w:style>
-  <w:style w:type="character" w:customStyle="1" w:styleId="AlertTok">
+  <w:style w:customStyle="1" w:styleId="AlertTok" w:type="character">
     <w:name w:val="AlertTok"/>
     <w:basedOn w:val="VerbatimChar"/>
     <w:rPr>
@@ -13292,7 +13310,7 @@
       <w:b/>
     </w:rPr>
   </w:style>
-  <w:style w:type="character" w:customStyle="1" w:styleId="ErrorTok">
+  <w:style w:customStyle="1" w:styleId="ErrorTok" w:type="character">
     <w:name w:val="ErrorTok"/>
     <w:basedOn w:val="VerbatimChar"/>
     <w:rPr>
@@ -13300,7 +13318,7 @@
       <w:b/>
     </w:rPr>
   </w:style>
-  <w:style w:type="character" w:customStyle="1" w:styleId="NormalTok">
+  <w:style w:customStyle="1" w:styleId="NormalTok" w:type="character">
     <w:name w:val="NormalTok"/>
     <w:basedOn w:val="VerbatimChar"/>
     <w:rPr/>

</xml_diff>